<commit_message>
Updated the validation report with evidence
</commit_message>
<xml_diff>
--- a/Evidence/QuickGrid Query Parameter Names.docx
+++ b/Evidence/QuickGrid Query Parameter Names.docx
@@ -194,10 +194,10 @@
         <w:tblLook w:val="04A0" w:firstRow="1" w:lastRow="0" w:firstColumn="1" w:lastColumn="0" w:noHBand="0" w:noVBand="1"/>
       </w:tblPr>
       <w:tblGrid>
-        <w:gridCol w:w="584"/>
-        <w:gridCol w:w="3498"/>
-        <w:gridCol w:w="1279"/>
-        <w:gridCol w:w="3989"/>
+        <w:gridCol w:w="565"/>
+        <w:gridCol w:w="2779"/>
+        <w:gridCol w:w="1205"/>
+        <w:gridCol w:w="4801"/>
       </w:tblGrid>
       <w:tr>
         <w:tc>
@@ -450,7 +450,7 @@
               <w:spacing w:after="160" w:line="278" w:lineRule="auto"/>
             </w:pPr>
             <w:r>
-              <w:t xml:space="preserve">Single </w:t>
+              <w:t xml:space="preserve">Two </w:t>
             </w:r>
             <w:proofErr w:type="spellStart"/>
             <w:r>
@@ -458,7 +458,7 @@
             </w:r>
             <w:proofErr w:type="spellEnd"/>
             <w:r>
-              <w:t xml:space="preserve"> using default query parameter names</w:t>
+              <w:t xml:space="preserve"> instances using default parameter names</w:t>
             </w:r>
           </w:p>
         </w:tc>
@@ -486,7 +486,16 @@
               <w:spacing w:after="160" w:line="278" w:lineRule="auto"/>
             </w:pPr>
             <w:r>
-              <w:t>Default query parameters were generated correctly during paging and sorting operations.</w:t>
+              <w:t>Sorting</w:t>
+            </w:r>
+            <w:r>
+              <w:t xml:space="preserve"> and </w:t>
+            </w:r>
+            <w:r>
+              <w:t>paging</w:t>
+            </w:r>
+            <w:r>
+              <w:t xml:space="preserve"> the Products grid updated both Products and People grids because both used the same query parameter names.</w:t>
             </w:r>
           </w:p>
         </w:tc>
@@ -516,15 +525,7 @@
               <w:spacing w:after="160" w:line="278" w:lineRule="auto"/>
             </w:pPr>
             <w:r>
-              <w:t xml:space="preserve">Sort </w:t>
-            </w:r>
-            <w:proofErr w:type="spellStart"/>
-            <w:r>
-              <w:t>QuickGrid</w:t>
-            </w:r>
-            <w:proofErr w:type="spellEnd"/>
-            <w:r>
-              <w:t xml:space="preserve"> using default parameter names</w:t>
+              <w:t>Sort first grid and observe second grid</w:t>
             </w:r>
           </w:p>
         </w:tc>
@@ -552,7 +553,7 @@
               <w:spacing w:after="160" w:line="278" w:lineRule="auto"/>
             </w:pPr>
             <w:r>
-              <w:t>URL updated with sort-related query parameters as expected.</w:t>
+              <w:t>Sorting the Products grid updated both Products and People grids because both used the same query parameter names.</w:t>
             </w:r>
           </w:p>
         </w:tc>
@@ -582,15 +583,7 @@
               <w:spacing w:after="160" w:line="278" w:lineRule="auto"/>
             </w:pPr>
             <w:r>
-              <w:t xml:space="preserve">Page </w:t>
-            </w:r>
-            <w:proofErr w:type="spellStart"/>
-            <w:r>
-              <w:t>QuickGrid</w:t>
-            </w:r>
-            <w:proofErr w:type="spellEnd"/>
-            <w:r>
-              <w:t xml:space="preserve"> using default parameter names</w:t>
+              <w:t>Page first grid and observe second grid</w:t>
             </w:r>
           </w:p>
         </w:tc>
@@ -618,7 +611,10 @@
               <w:spacing w:after="160" w:line="278" w:lineRule="auto"/>
             </w:pPr>
             <w:r>
-              <w:t>Paging state was reflected in the URL correctly.</w:t>
+              <w:t>Paging</w:t>
+            </w:r>
+            <w:r>
+              <w:t xml:space="preserve"> the Products grid updated both Products and People grids because both used the same query parameter names.</w:t>
             </w:r>
           </w:p>
         </w:tc>
@@ -634,6 +630,7 @@
               <w:spacing w:after="160" w:line="278" w:lineRule="auto"/>
             </w:pPr>
             <w:r>
+              <w:lastRenderedPageBreak/>
               <w:t>6</w:t>
             </w:r>
           </w:p>
@@ -648,15 +645,13 @@
               <w:spacing w:after="160" w:line="278" w:lineRule="auto"/>
             </w:pPr>
             <w:r>
-              <w:t xml:space="preserve">Two </w:t>
-            </w:r>
-            <w:proofErr w:type="spellStart"/>
-            <w:r>
-              <w:t>QuickGrid</w:t>
-            </w:r>
-            <w:proofErr w:type="spellEnd"/>
-            <w:r>
-              <w:t xml:space="preserve"> instances using default parameter names</w:t>
+              <w:t xml:space="preserve">Configure unique </w:t>
+            </w:r>
+            <w:r>
+              <w:t xml:space="preserve">custom prefixes </w:t>
+            </w:r>
+            <w:r>
+              <w:t>for each grid</w:t>
             </w:r>
           </w:p>
         </w:tc>
@@ -684,7 +679,7 @@
               <w:spacing w:after="160" w:line="278" w:lineRule="auto"/>
             </w:pPr>
             <w:r>
-              <w:t>Shared query parameter behavior was observed as expected.</w:t>
+              <w:t>Custom query parameter names were generated successfully.</w:t>
             </w:r>
           </w:p>
         </w:tc>
@@ -714,7 +709,7 @@
               <w:spacing w:after="160" w:line="278" w:lineRule="auto"/>
             </w:pPr>
             <w:r>
-              <w:t>Sort first grid and observe second grid</w:t>
+              <w:t>Sort first grid after applying custom prefixes</w:t>
             </w:r>
           </w:p>
         </w:tc>
@@ -742,7 +737,7 @@
               <w:spacing w:after="160" w:line="278" w:lineRule="auto"/>
             </w:pPr>
             <w:r>
-              <w:t>Behavior matched expected shared query parameter state.</w:t>
+              <w:t>Sorting the Products grid did not affect the People grid after unique prefixes were applied.</w:t>
             </w:r>
           </w:p>
         </w:tc>
@@ -758,7 +753,6 @@
               <w:spacing w:after="160" w:line="278" w:lineRule="auto"/>
             </w:pPr>
             <w:r>
-              <w:lastRenderedPageBreak/>
               <w:t>8</w:t>
             </w:r>
           </w:p>
@@ -773,7 +767,7 @@
               <w:spacing w:after="160" w:line="278" w:lineRule="auto"/>
             </w:pPr>
             <w:r>
-              <w:t>Page first grid and observe second grid</w:t>
+              <w:t>Page first grid after applying custom prefixes</w:t>
             </w:r>
           </w:p>
         </w:tc>
@@ -801,7 +795,7 @@
               <w:spacing w:after="160" w:line="278" w:lineRule="auto"/>
             </w:pPr>
             <w:r>
-              <w:t>Shared paging state behaved as expected when default names were used.</w:t>
+              <w:t>Products moved to page 2 while People remained on page 1 after unique prefixes were applied.</w:t>
             </w:r>
           </w:p>
         </w:tc>
@@ -831,16 +825,7 @@
               <w:spacing w:after="160" w:line="278" w:lineRule="auto"/>
             </w:pPr>
             <w:r>
-              <w:t xml:space="preserve">Configure unique </w:t>
-            </w:r>
-            <w:r>
-              <w:t>custom prefixes</w:t>
-            </w:r>
-            <w:r>
-              <w:t xml:space="preserve"> </w:t>
-            </w:r>
-            <w:r>
-              <w:t>for each grid</w:t>
+              <w:t>Sort and page both grids using unique prefixes</w:t>
             </w:r>
           </w:p>
         </w:tc>
@@ -868,7 +853,7 @@
               <w:spacing w:after="160" w:line="278" w:lineRule="auto"/>
             </w:pPr>
             <w:r>
-              <w:t>Custom query parameter names were generated successfully.</w:t>
+              <w:t>Both grids maintained independent URL state without conflicts.</w:t>
             </w:r>
           </w:p>
         </w:tc>
@@ -884,21 +869,24 @@
               <w:spacing w:after="160" w:line="278" w:lineRule="auto"/>
             </w:pPr>
             <w:r>
-              <w:t>10</w:t>
-            </w:r>
-          </w:p>
-        </w:tc>
-        <w:tc>
-          <w:tcPr>
-            <w:tcW w:w="0" w:type="auto"/>
-            <w:hideMark/>
-          </w:tcPr>
-          <w:p>
-            <w:pPr>
-              <w:spacing w:after="160" w:line="278" w:lineRule="auto"/>
-            </w:pPr>
-            <w:r>
-              <w:t>Sort first grid after applying custom prefixes</w:t>
+              <w:t>1</w:t>
+            </w:r>
+            <w:r>
+              <w:t>0</w:t>
+            </w:r>
+          </w:p>
+        </w:tc>
+        <w:tc>
+          <w:tcPr>
+            <w:tcW w:w="0" w:type="auto"/>
+            <w:hideMark/>
+          </w:tcPr>
+          <w:p>
+            <w:pPr>
+              <w:spacing w:after="160" w:line="278" w:lineRule="auto"/>
+            </w:pPr>
+            <w:r>
+              <w:t>Copy URL and open in InPrivate window</w:t>
             </w:r>
           </w:p>
         </w:tc>
@@ -926,7 +914,7 @@
               <w:spacing w:after="160" w:line="278" w:lineRule="auto"/>
             </w:pPr>
             <w:r>
-              <w:t>Sorting state remained isolated to the targeted grid.</w:t>
+              <w:t>Grid paging and sorting state restored correctly from URL parameters.</w:t>
             </w:r>
           </w:p>
         </w:tc>
@@ -942,21 +930,24 @@
               <w:spacing w:after="160" w:line="278" w:lineRule="auto"/>
             </w:pPr>
             <w:r>
-              <w:t>11</w:t>
-            </w:r>
-          </w:p>
-        </w:tc>
-        <w:tc>
-          <w:tcPr>
-            <w:tcW w:w="0" w:type="auto"/>
-            <w:hideMark/>
-          </w:tcPr>
-          <w:p>
-            <w:pPr>
-              <w:spacing w:after="160" w:line="278" w:lineRule="auto"/>
-            </w:pPr>
-            <w:r>
-              <w:t>Page first grid after applying custom prefixes</w:t>
+              <w:t>1</w:t>
+            </w:r>
+            <w:r>
+              <w:t>1</w:t>
+            </w:r>
+          </w:p>
+        </w:tc>
+        <w:tc>
+          <w:tcPr>
+            <w:tcW w:w="0" w:type="auto"/>
+            <w:hideMark/>
+          </w:tcPr>
+          <w:p>
+            <w:pPr>
+              <w:spacing w:after="160" w:line="278" w:lineRule="auto"/>
+            </w:pPr>
+            <w:r>
+              <w:t>Browser refresh with custom parameter names</w:t>
             </w:r>
           </w:p>
         </w:tc>
@@ -983,8 +974,13 @@
             <w:pPr>
               <w:spacing w:after="160" w:line="278" w:lineRule="auto"/>
             </w:pPr>
-            <w:r>
-              <w:t>Paging state remained isolated to the targeted grid.</w:t>
+            <w:proofErr w:type="spellStart"/>
+            <w:r>
+              <w:t>QuickGrid</w:t>
+            </w:r>
+            <w:proofErr w:type="spellEnd"/>
+            <w:r>
+              <w:t xml:space="preserve"> state was restored successfully after refresh.</w:t>
             </w:r>
           </w:p>
         </w:tc>
@@ -1000,21 +996,24 @@
               <w:spacing w:after="160" w:line="278" w:lineRule="auto"/>
             </w:pPr>
             <w:r>
-              <w:t>12</w:t>
-            </w:r>
-          </w:p>
-        </w:tc>
-        <w:tc>
-          <w:tcPr>
-            <w:tcW w:w="0" w:type="auto"/>
-            <w:hideMark/>
-          </w:tcPr>
-          <w:p>
-            <w:pPr>
-              <w:spacing w:after="160" w:line="278" w:lineRule="auto"/>
-            </w:pPr>
-            <w:r>
-              <w:t>Sort and page both grids using unique prefixes</w:t>
+              <w:t>1</w:t>
+            </w:r>
+            <w:r>
+              <w:t>2</w:t>
+            </w:r>
+          </w:p>
+        </w:tc>
+        <w:tc>
+          <w:tcPr>
+            <w:tcW w:w="0" w:type="auto"/>
+            <w:hideMark/>
+          </w:tcPr>
+          <w:p>
+            <w:pPr>
+              <w:spacing w:after="160" w:line="278" w:lineRule="auto"/>
+            </w:pPr>
+            <w:r>
+              <w:t>Browser Back and Forward navigation</w:t>
             </w:r>
           </w:p>
         </w:tc>
@@ -1042,7 +1041,13 @@
               <w:spacing w:after="160" w:line="278" w:lineRule="auto"/>
             </w:pPr>
             <w:r>
-              <w:t>Both grids maintained independent URL state without conflicts.</w:t>
+              <w:t xml:space="preserve">Paging and </w:t>
+            </w:r>
+            <w:r>
+              <w:t>sorting</w:t>
+            </w:r>
+            <w:r>
+              <w:t xml:space="preserve"> remained consistent during navigation.</w:t>
             </w:r>
           </w:p>
         </w:tc>
@@ -1058,21 +1063,24 @@
               <w:spacing w:after="160" w:line="278" w:lineRule="auto"/>
             </w:pPr>
             <w:r>
-              <w:t>13</w:t>
-            </w:r>
-          </w:p>
-        </w:tc>
-        <w:tc>
-          <w:tcPr>
-            <w:tcW w:w="0" w:type="auto"/>
-            <w:hideMark/>
-          </w:tcPr>
-          <w:p>
-            <w:pPr>
-              <w:spacing w:after="160" w:line="278" w:lineRule="auto"/>
-            </w:pPr>
-            <w:r>
-              <w:t>Copy URL and open in InPrivate window</w:t>
+              <w:t>1</w:t>
+            </w:r>
+            <w:r>
+              <w:t>3</w:t>
+            </w:r>
+          </w:p>
+        </w:tc>
+        <w:tc>
+          <w:tcPr>
+            <w:tcW w:w="0" w:type="auto"/>
+            <w:hideMark/>
+          </w:tcPr>
+          <w:p>
+            <w:pPr>
+              <w:spacing w:after="160" w:line="278" w:lineRule="auto"/>
+            </w:pPr>
+            <w:r>
+              <w:t>Page using existing 'page' and 'sort' query parameters with default grid names</w:t>
             </w:r>
           </w:p>
         </w:tc>
@@ -1100,7 +1108,15 @@
               <w:spacing w:after="160" w:line="278" w:lineRule="auto"/>
             </w:pPr>
             <w:r>
-              <w:t>Grid paging and sorting state restored correctly from URL parameters.</w:t>
+              <w:t xml:space="preserve">When </w:t>
+            </w:r>
+            <w:proofErr w:type="spellStart"/>
+            <w:r>
+              <w:t>QuickGrid</w:t>
+            </w:r>
+            <w:proofErr w:type="spellEnd"/>
+            <w:r>
+              <w:t xml:space="preserve"> used default query parameter names, the page-owned page and sort parameters shared state with the grid.</w:t>
             </w:r>
           </w:p>
         </w:tc>
@@ -1116,21 +1132,32 @@
               <w:spacing w:after="160" w:line="278" w:lineRule="auto"/>
             </w:pPr>
             <w:r>
-              <w:t>14</w:t>
-            </w:r>
-          </w:p>
-        </w:tc>
-        <w:tc>
-          <w:tcPr>
-            <w:tcW w:w="0" w:type="auto"/>
-            <w:hideMark/>
-          </w:tcPr>
-          <w:p>
-            <w:pPr>
-              <w:spacing w:after="160" w:line="278" w:lineRule="auto"/>
-            </w:pPr>
-            <w:r>
-              <w:t>Browser refresh with custom parameter names</w:t>
+              <w:t>1</w:t>
+            </w:r>
+            <w:r>
+              <w:t>4</w:t>
+            </w:r>
+          </w:p>
+        </w:tc>
+        <w:tc>
+          <w:tcPr>
+            <w:tcW w:w="0" w:type="auto"/>
+            <w:hideMark/>
+          </w:tcPr>
+          <w:p>
+            <w:pPr>
+              <w:spacing w:after="160" w:line="278" w:lineRule="auto"/>
+            </w:pPr>
+            <w:r>
+              <w:t xml:space="preserve">Move </w:t>
+            </w:r>
+            <w:proofErr w:type="spellStart"/>
+            <w:r>
+              <w:t>QuickGrid</w:t>
+            </w:r>
+            <w:proofErr w:type="spellEnd"/>
+            <w:r>
+              <w:t xml:space="preserve"> to custom parameter names on same page</w:t>
             </w:r>
           </w:p>
         </w:tc>
@@ -1157,13 +1184,16 @@
             <w:pPr>
               <w:spacing w:after="160" w:line="278" w:lineRule="auto"/>
             </w:pPr>
+            <w:r>
+              <w:t xml:space="preserve">After moving </w:t>
+            </w:r>
             <w:proofErr w:type="spellStart"/>
             <w:r>
               <w:t>QuickGrid</w:t>
             </w:r>
             <w:proofErr w:type="spellEnd"/>
             <w:r>
-              <w:t xml:space="preserve"> state was restored successfully after refresh.</w:t>
+              <w:t xml:space="preserve"> to custom query parameter names, the page-owned page and sort values remained unchanged while grid paging and sorting continued to function correctly.</w:t>
             </w:r>
           </w:p>
         </w:tc>
@@ -1179,21 +1209,24 @@
               <w:spacing w:after="160" w:line="278" w:lineRule="auto"/>
             </w:pPr>
             <w:r>
-              <w:t>15</w:t>
-            </w:r>
-          </w:p>
-        </w:tc>
-        <w:tc>
-          <w:tcPr>
-            <w:tcW w:w="0" w:type="auto"/>
-            <w:hideMark/>
-          </w:tcPr>
-          <w:p>
-            <w:pPr>
-              <w:spacing w:after="160" w:line="278" w:lineRule="auto"/>
-            </w:pPr>
-            <w:r>
-              <w:t>Browser Back and Forward navigation</w:t>
+              <w:t>1</w:t>
+            </w:r>
+            <w:r>
+              <w:t>5</w:t>
+            </w:r>
+          </w:p>
+        </w:tc>
+        <w:tc>
+          <w:tcPr>
+            <w:tcW w:w="0" w:type="auto"/>
+            <w:hideMark/>
+          </w:tcPr>
+          <w:p>
+            <w:pPr>
+              <w:spacing w:after="160" w:line="278" w:lineRule="auto"/>
+            </w:pPr>
+            <w:r>
+              <w:t>Configure two grids using identical custom names intentionally</w:t>
             </w:r>
           </w:p>
         </w:tc>
@@ -1221,13 +1254,7 @@
               <w:spacing w:after="160" w:line="278" w:lineRule="auto"/>
             </w:pPr>
             <w:r>
-              <w:t xml:space="preserve">Paging and </w:t>
-            </w:r>
-            <w:r>
-              <w:t>sorting</w:t>
-            </w:r>
-            <w:r>
-              <w:t xml:space="preserve"> remained consistent during navigation.</w:t>
+              <w:t>Shared state behavior was observed as expected due to identical parameter names.</w:t>
             </w:r>
           </w:p>
         </w:tc>
@@ -1243,21 +1270,24 @@
               <w:spacing w:after="160" w:line="278" w:lineRule="auto"/>
             </w:pPr>
             <w:r>
-              <w:t>16</w:t>
-            </w:r>
-          </w:p>
-        </w:tc>
-        <w:tc>
-          <w:tcPr>
-            <w:tcW w:w="0" w:type="auto"/>
-            <w:hideMark/>
-          </w:tcPr>
-          <w:p>
-            <w:pPr>
-              <w:spacing w:after="160" w:line="278" w:lineRule="auto"/>
-            </w:pPr>
-            <w:r>
-              <w:t>Page using existing 'page' and 'sort' query parameters with default grid names</w:t>
+              <w:t>1</w:t>
+            </w:r>
+            <w:r>
+              <w:t>6</w:t>
+            </w:r>
+          </w:p>
+        </w:tc>
+        <w:tc>
+          <w:tcPr>
+            <w:tcW w:w="0" w:type="auto"/>
+            <w:hideMark/>
+          </w:tcPr>
+          <w:p>
+            <w:pPr>
+              <w:spacing w:after="160" w:line="278" w:lineRule="auto"/>
+            </w:pPr>
+            <w:r>
+              <w:t>Validate custom prefixes containing separators</w:t>
             </w:r>
           </w:p>
         </w:tc>
@@ -1285,15 +1315,7 @@
               <w:spacing w:after="160" w:line="278" w:lineRule="auto"/>
             </w:pPr>
             <w:r>
-              <w:t xml:space="preserve">Existing page query parameters interacted with </w:t>
-            </w:r>
-            <w:proofErr w:type="spellStart"/>
-            <w:r>
-              <w:t>QuickGrid</w:t>
-            </w:r>
-            <w:proofErr w:type="spellEnd"/>
-            <w:r>
-              <w:t xml:space="preserve"> as expected.</w:t>
+              <w:t>Prefix values were applied exactly as configured.</w:t>
             </w:r>
           </w:p>
         </w:tc>
@@ -1309,6 +1331,7 @@
               <w:spacing w:after="160" w:line="278" w:lineRule="auto"/>
             </w:pPr>
             <w:r>
+              <w:lastRenderedPageBreak/>
               <w:t>17</w:t>
             </w:r>
           </w:p>
@@ -1323,15 +1346,16 @@
               <w:spacing w:after="160" w:line="278" w:lineRule="auto"/>
             </w:pPr>
             <w:r>
-              <w:t xml:space="preserve">Move </w:t>
-            </w:r>
-            <w:proofErr w:type="spellStart"/>
-            <w:r>
-              <w:t>QuickGrid</w:t>
-            </w:r>
-            <w:proofErr w:type="spellEnd"/>
-            <w:r>
-              <w:t xml:space="preserve"> to custom parameter names on same page</w:t>
+              <w:t>Validate URL-encoded parameter names</w:t>
+            </w:r>
+            <w:r>
+              <w:t xml:space="preserve"> (</w:t>
+            </w:r>
+            <w:r>
+              <w:t>parameter name containing a space</w:t>
+            </w:r>
+            <w:r>
+              <w:t>)</w:t>
             </w:r>
           </w:p>
         </w:tc>
@@ -1359,7 +1383,7 @@
               <w:spacing w:after="160" w:line="278" w:lineRule="auto"/>
             </w:pPr>
             <w:r>
-              <w:t>Existing application query parameters remained unaffected.</w:t>
+              <w:t>Parameter values round-tripped correctly through URL encoding and decoding.</w:t>
             </w:r>
           </w:p>
         </w:tc>
@@ -1376,196 +1400,6 @@
             </w:pPr>
             <w:r>
               <w:t>18</w:t>
-            </w:r>
-          </w:p>
-        </w:tc>
-        <w:tc>
-          <w:tcPr>
-            <w:tcW w:w="0" w:type="auto"/>
-            <w:hideMark/>
-          </w:tcPr>
-          <w:p>
-            <w:pPr>
-              <w:spacing w:after="160" w:line="278" w:lineRule="auto"/>
-            </w:pPr>
-            <w:r>
-              <w:t>Configure two grids using identical custom names intentionally</w:t>
-            </w:r>
-          </w:p>
-        </w:tc>
-        <w:tc>
-          <w:tcPr>
-            <w:tcW w:w="0" w:type="auto"/>
-            <w:hideMark/>
-          </w:tcPr>
-          <w:p>
-            <w:pPr>
-              <w:spacing w:after="160" w:line="278" w:lineRule="auto"/>
-            </w:pPr>
-            <w:r>
-              <w:t>Works Properly</w:t>
-            </w:r>
-          </w:p>
-        </w:tc>
-        <w:tc>
-          <w:tcPr>
-            <w:tcW w:w="0" w:type="auto"/>
-            <w:hideMark/>
-          </w:tcPr>
-          <w:p>
-            <w:pPr>
-              <w:spacing w:after="160" w:line="278" w:lineRule="auto"/>
-            </w:pPr>
-            <w:r>
-              <w:t>Shared state behavior was observed as expected due to identical parameter names.</w:t>
-            </w:r>
-          </w:p>
-        </w:tc>
-      </w:tr>
-      <w:tr>
-        <w:tc>
-          <w:tcPr>
-            <w:tcW w:w="0" w:type="auto"/>
-            <w:hideMark/>
-          </w:tcPr>
-          <w:p>
-            <w:pPr>
-              <w:spacing w:after="160" w:line="278" w:lineRule="auto"/>
-            </w:pPr>
-            <w:r>
-              <w:t>19</w:t>
-            </w:r>
-          </w:p>
-        </w:tc>
-        <w:tc>
-          <w:tcPr>
-            <w:tcW w:w="0" w:type="auto"/>
-            <w:hideMark/>
-          </w:tcPr>
-          <w:p>
-            <w:pPr>
-              <w:spacing w:after="160" w:line="278" w:lineRule="auto"/>
-            </w:pPr>
-            <w:r>
-              <w:t>Validate custom prefixes containing separators</w:t>
-            </w:r>
-          </w:p>
-        </w:tc>
-        <w:tc>
-          <w:tcPr>
-            <w:tcW w:w="0" w:type="auto"/>
-            <w:hideMark/>
-          </w:tcPr>
-          <w:p>
-            <w:pPr>
-              <w:spacing w:after="160" w:line="278" w:lineRule="auto"/>
-            </w:pPr>
-            <w:r>
-              <w:t>Works Properly</w:t>
-            </w:r>
-          </w:p>
-        </w:tc>
-        <w:tc>
-          <w:tcPr>
-            <w:tcW w:w="0" w:type="auto"/>
-            <w:hideMark/>
-          </w:tcPr>
-          <w:p>
-            <w:pPr>
-              <w:spacing w:after="160" w:line="278" w:lineRule="auto"/>
-            </w:pPr>
-            <w:r>
-              <w:t>Prefix values were applied exactly as configured.</w:t>
-            </w:r>
-          </w:p>
-        </w:tc>
-      </w:tr>
-      <w:tr>
-        <w:tc>
-          <w:tcPr>
-            <w:tcW w:w="0" w:type="auto"/>
-            <w:hideMark/>
-          </w:tcPr>
-          <w:p>
-            <w:pPr>
-              <w:spacing w:after="160" w:line="278" w:lineRule="auto"/>
-            </w:pPr>
-            <w:r>
-              <w:lastRenderedPageBreak/>
-              <w:t>2</w:t>
-            </w:r>
-            <w:r>
-              <w:t>0</w:t>
-            </w:r>
-          </w:p>
-        </w:tc>
-        <w:tc>
-          <w:tcPr>
-            <w:tcW w:w="0" w:type="auto"/>
-            <w:hideMark/>
-          </w:tcPr>
-          <w:p>
-            <w:pPr>
-              <w:spacing w:after="160" w:line="278" w:lineRule="auto"/>
-            </w:pPr>
-            <w:r>
-              <w:t>Validate URL-encoded parameter names</w:t>
-            </w:r>
-            <w:r>
-              <w:t xml:space="preserve"> (</w:t>
-            </w:r>
-            <w:r>
-              <w:t>parameter name containing a space</w:t>
-            </w:r>
-            <w:r>
-              <w:t>)</w:t>
-            </w:r>
-          </w:p>
-        </w:tc>
-        <w:tc>
-          <w:tcPr>
-            <w:tcW w:w="0" w:type="auto"/>
-            <w:hideMark/>
-          </w:tcPr>
-          <w:p>
-            <w:pPr>
-              <w:spacing w:after="160" w:line="278" w:lineRule="auto"/>
-            </w:pPr>
-            <w:r>
-              <w:t>Works Properly</w:t>
-            </w:r>
-          </w:p>
-        </w:tc>
-        <w:tc>
-          <w:tcPr>
-            <w:tcW w:w="0" w:type="auto"/>
-            <w:hideMark/>
-          </w:tcPr>
-          <w:p>
-            <w:pPr>
-              <w:spacing w:after="160" w:line="278" w:lineRule="auto"/>
-            </w:pPr>
-            <w:r>
-              <w:t>Parameter values round-tripped correctly through URL encoding and decoding.</w:t>
-            </w:r>
-          </w:p>
-        </w:tc>
-      </w:tr>
-      <w:tr>
-        <w:tc>
-          <w:tcPr>
-            <w:tcW w:w="0" w:type="auto"/>
-            <w:hideMark/>
-          </w:tcPr>
-          <w:p>
-            <w:pPr>
-              <w:spacing w:after="160" w:line="278" w:lineRule="auto"/>
-            </w:pPr>
-            <w:r>
-              <w:t>2</w:t>
-            </w:r>
-            <w:r>
-              <w:t>1</w:t>
             </w:r>
           </w:p>
         </w:tc>
@@ -1645,14 +1479,14 @@
         <w:tblLook w:val="04A0" w:firstRow="1" w:lastRow="0" w:firstColumn="1" w:lastColumn="0" w:noHBand="0" w:noVBand="1"/>
       </w:tblPr>
       <w:tblGrid>
-        <w:gridCol w:w="2867"/>
-        <w:gridCol w:w="3139"/>
-        <w:gridCol w:w="3344"/>
+        <w:gridCol w:w="2212"/>
+        <w:gridCol w:w="3569"/>
+        <w:gridCol w:w="3569"/>
       </w:tblGrid>
       <w:tr>
         <w:tc>
           <w:tcPr>
-            <w:tcW w:w="2831" w:type="dxa"/>
+            <w:tcW w:w="2867" w:type="dxa"/>
             <w:hideMark/>
           </w:tcPr>
           <w:p>
@@ -1675,7 +1509,7 @@
         </w:tc>
         <w:tc>
           <w:tcPr>
-            <w:tcW w:w="3158" w:type="dxa"/>
+            <w:tcW w:w="3139" w:type="dxa"/>
             <w:hideMark/>
           </w:tcPr>
           <w:p>
@@ -1698,7 +1532,7 @@
         </w:tc>
         <w:tc>
           <w:tcPr>
-            <w:tcW w:w="3361" w:type="dxa"/>
+            <w:tcW w:w="3344" w:type="dxa"/>
             <w:hideMark/>
           </w:tcPr>
           <w:p>
@@ -1723,7 +1557,7 @@
       <w:tr>
         <w:tc>
           <w:tcPr>
-            <w:tcW w:w="2831" w:type="dxa"/>
+            <w:tcW w:w="2867" w:type="dxa"/>
             <w:hideMark/>
           </w:tcPr>
           <w:p>
@@ -1737,7 +1571,7 @@
         </w:tc>
         <w:tc>
           <w:tcPr>
-            <w:tcW w:w="3158" w:type="dxa"/>
+            <w:tcW w:w="3139" w:type="dxa"/>
             <w:hideMark/>
           </w:tcPr>
           <w:p>
@@ -1756,7 +1590,7 @@
         </w:tc>
         <w:tc>
           <w:tcPr>
-            <w:tcW w:w="3361" w:type="dxa"/>
+            <w:tcW w:w="3344" w:type="dxa"/>
             <w:hideMark/>
           </w:tcPr>
           <w:p>
@@ -1777,7 +1611,7 @@
       <w:tr>
         <w:tc>
           <w:tcPr>
-            <w:tcW w:w="2831" w:type="dxa"/>
+            <w:tcW w:w="2867" w:type="dxa"/>
             <w:hideMark/>
           </w:tcPr>
           <w:p>
@@ -1791,7 +1625,7 @@
         </w:tc>
         <w:tc>
           <w:tcPr>
-            <w:tcW w:w="3158" w:type="dxa"/>
+            <w:tcW w:w="3139" w:type="dxa"/>
             <w:hideMark/>
           </w:tcPr>
           <w:p>
@@ -1810,7 +1644,7 @@
         </w:tc>
         <w:tc>
           <w:tcPr>
-            <w:tcW w:w="3361" w:type="dxa"/>
+            <w:tcW w:w="3344" w:type="dxa"/>
             <w:hideMark/>
           </w:tcPr>
           <w:p>
@@ -1831,7 +1665,7 @@
       <w:tr>
         <w:tc>
           <w:tcPr>
-            <w:tcW w:w="2831" w:type="dxa"/>
+            <w:tcW w:w="2867" w:type="dxa"/>
             <w:hideMark/>
           </w:tcPr>
           <w:p>
@@ -1845,7 +1679,7 @@
         </w:tc>
         <w:tc>
           <w:tcPr>
-            <w:tcW w:w="3158" w:type="dxa"/>
+            <w:tcW w:w="3139" w:type="dxa"/>
             <w:hideMark/>
           </w:tcPr>
           <w:p>
@@ -1864,7 +1698,7 @@
         </w:tc>
         <w:tc>
           <w:tcPr>
-            <w:tcW w:w="3361" w:type="dxa"/>
+            <w:tcW w:w="3344" w:type="dxa"/>
             <w:hideMark/>
           </w:tcPr>
           <w:p>
@@ -1885,7 +1719,7 @@
       <w:tr>
         <w:tc>
           <w:tcPr>
-            <w:tcW w:w="2831" w:type="dxa"/>
+            <w:tcW w:w="2867" w:type="dxa"/>
             <w:hideMark/>
           </w:tcPr>
           <w:p>
@@ -1899,7 +1733,7 @@
         </w:tc>
         <w:tc>
           <w:tcPr>
-            <w:tcW w:w="3158" w:type="dxa"/>
+            <w:tcW w:w="3139" w:type="dxa"/>
             <w:hideMark/>
           </w:tcPr>
           <w:p>
@@ -1918,7 +1752,7 @@
         </w:tc>
         <w:tc>
           <w:tcPr>
-            <w:tcW w:w="3361" w:type="dxa"/>
+            <w:tcW w:w="3344" w:type="dxa"/>
             <w:hideMark/>
           </w:tcPr>
           <w:p>
@@ -1939,7 +1773,7 @@
       <w:tr>
         <w:tc>
           <w:tcPr>
-            <w:tcW w:w="2831" w:type="dxa"/>
+            <w:tcW w:w="2867" w:type="dxa"/>
             <w:hideMark/>
           </w:tcPr>
           <w:p>
@@ -1953,7 +1787,7 @@
         </w:tc>
         <w:tc>
           <w:tcPr>
-            <w:tcW w:w="3158" w:type="dxa"/>
+            <w:tcW w:w="3139" w:type="dxa"/>
             <w:hideMark/>
           </w:tcPr>
           <w:p>
@@ -1972,7 +1806,7 @@
         </w:tc>
         <w:tc>
           <w:tcPr>
-            <w:tcW w:w="3361" w:type="dxa"/>
+            <w:tcW w:w="3344" w:type="dxa"/>
             <w:hideMark/>
           </w:tcPr>
           <w:p>
@@ -1993,7 +1827,7 @@
       <w:tr>
         <w:tc>
           <w:tcPr>
-            <w:tcW w:w="2831" w:type="dxa"/>
+            <w:tcW w:w="2867" w:type="dxa"/>
             <w:hideMark/>
           </w:tcPr>
           <w:p>
@@ -2015,7 +1849,7 @@
         </w:tc>
         <w:tc>
           <w:tcPr>
-            <w:tcW w:w="3158" w:type="dxa"/>
+            <w:tcW w:w="3139" w:type="dxa"/>
             <w:hideMark/>
           </w:tcPr>
           <w:p>
@@ -2034,7 +1868,7 @@
         </w:tc>
         <w:tc>
           <w:tcPr>
-            <w:tcW w:w="3361" w:type="dxa"/>
+            <w:tcW w:w="3344" w:type="dxa"/>
             <w:hideMark/>
           </w:tcPr>
           <w:p>
@@ -2055,21 +1889,22 @@
       <w:tr>
         <w:tc>
           <w:tcPr>
-            <w:tcW w:w="2831" w:type="dxa"/>
-            <w:hideMark/>
-          </w:tcPr>
-          <w:p>
-            <w:pPr>
-              <w:spacing w:after="160" w:line="278" w:lineRule="auto"/>
-            </w:pPr>
-            <w:r>
+            <w:tcW w:w="2867" w:type="dxa"/>
+            <w:hideMark/>
+          </w:tcPr>
+          <w:p>
+            <w:pPr>
+              <w:spacing w:after="160" w:line="278" w:lineRule="auto"/>
+            </w:pPr>
+            <w:r>
+              <w:lastRenderedPageBreak/>
               <w:t>URL Encoded Parameter Names Validation</w:t>
             </w:r>
           </w:p>
         </w:tc>
         <w:tc>
           <w:tcPr>
-            <w:tcW w:w="3158" w:type="dxa"/>
+            <w:tcW w:w="3139" w:type="dxa"/>
             <w:hideMark/>
           </w:tcPr>
           <w:p>
@@ -2088,7 +1923,7 @@
         </w:tc>
         <w:tc>
           <w:tcPr>
-            <w:tcW w:w="3361" w:type="dxa"/>
+            <w:tcW w:w="3344" w:type="dxa"/>
             <w:hideMark/>
           </w:tcPr>
           <w:p>
@@ -2106,15 +1941,283 @@
           </w:p>
         </w:tc>
       </w:tr>
+      <w:tr>
+        <w:tc>
+          <w:tcPr>
+            <w:tcW w:w="2867" w:type="dxa"/>
+          </w:tcPr>
+          <w:p>
+            <w:r>
+              <w:t>Browser Back and Forward navigation</w:t>
+            </w:r>
+          </w:p>
+        </w:tc>
+        <w:tc>
+          <w:tcPr>
+            <w:tcW w:w="3139" w:type="dxa"/>
+          </w:tcPr>
+          <w:p>
+            <w:hyperlink r:id="rId20" w:history="1">
+              <w:r>
+                <w:rPr>
+                  <w:rStyle w:val="Hyperlink"/>
+                </w:rPr>
+                <w:t>SSR_</w:t>
+              </w:r>
+              <w:r>
+                <w:rPr>
+                  <w:rStyle w:val="Hyperlink"/>
+                  <w:kern w:val="0"/>
+                  <w14:ligatures w14:val="none"/>
+                </w:rPr>
+                <w:t xml:space="preserve"> </w:t>
+              </w:r>
+              <w:proofErr w:type="spellStart"/>
+              <w:r>
+                <w:rPr>
+                  <w:rStyle w:val="Hyperlink"/>
+                </w:rPr>
+                <w:t>BrowserBack</w:t>
+              </w:r>
+              <w:r>
+                <w:rPr>
+                  <w:rStyle w:val="Hyperlink"/>
+                </w:rPr>
+                <w:t>A</w:t>
+              </w:r>
+              <w:r>
+                <w:rPr>
+                  <w:rStyle w:val="Hyperlink"/>
+                </w:rPr>
+                <w:t>nd</w:t>
+              </w:r>
+              <w:proofErr w:type="spellEnd"/>
+              <w:r>
+                <w:rPr>
+                  <w:rStyle w:val="Hyperlink"/>
+                </w:rPr>
+                <w:t xml:space="preserve"> Forward</w:t>
+              </w:r>
+              <w:r>
+                <w:rPr>
+                  <w:rStyle w:val="Hyperlink"/>
+                </w:rPr>
+                <w:t>N</w:t>
+              </w:r>
+              <w:r>
+                <w:rPr>
+                  <w:rStyle w:val="Hyperlink"/>
+                </w:rPr>
+                <w:t>avigation</w:t>
+              </w:r>
+              <w:r>
+                <w:rPr>
+                  <w:rStyle w:val="Hyperlink"/>
+                </w:rPr>
+                <w:t>.mp4</w:t>
+              </w:r>
+            </w:hyperlink>
+          </w:p>
+        </w:tc>
+        <w:tc>
+          <w:tcPr>
+            <w:tcW w:w="3344" w:type="dxa"/>
+          </w:tcPr>
+          <w:p>
+            <w:hyperlink r:id="rId21" w:history="1">
+              <w:r>
+                <w:rPr>
+                  <w:rStyle w:val="Hyperlink"/>
+                </w:rPr>
+                <w:t>S</w:t>
+              </w:r>
+              <w:r>
+                <w:rPr>
+                  <w:rStyle w:val="Hyperlink"/>
+                </w:rPr>
+                <w:t>erver</w:t>
+              </w:r>
+              <w:r>
+                <w:rPr>
+                  <w:rStyle w:val="Hyperlink"/>
+                </w:rPr>
+                <w:t>_</w:t>
+              </w:r>
+              <w:r>
+                <w:rPr>
+                  <w:rStyle w:val="Hyperlink"/>
+                  <w:kern w:val="0"/>
+                  <w14:ligatures w14:val="none"/>
+                </w:rPr>
+                <w:t xml:space="preserve"> </w:t>
+              </w:r>
+              <w:proofErr w:type="spellStart"/>
+              <w:r>
+                <w:rPr>
+                  <w:rStyle w:val="Hyperlink"/>
+                </w:rPr>
+                <w:t>BrowserBackAnd</w:t>
+              </w:r>
+              <w:proofErr w:type="spellEnd"/>
+              <w:r>
+                <w:rPr>
+                  <w:rStyle w:val="Hyperlink"/>
+                </w:rPr>
+                <w:t xml:space="preserve"> ForwardNavigation.mp4</w:t>
+              </w:r>
+            </w:hyperlink>
+          </w:p>
+        </w:tc>
+      </w:tr>
+      <w:tr>
+        <w:tc>
+          <w:tcPr>
+            <w:tcW w:w="2867" w:type="dxa"/>
+          </w:tcPr>
+          <w:p>
+            <w:r>
+              <w:t>Browser refresh with custom parameter names</w:t>
+            </w:r>
+          </w:p>
+        </w:tc>
+        <w:tc>
+          <w:tcPr>
+            <w:tcW w:w="3139" w:type="dxa"/>
+          </w:tcPr>
+          <w:p>
+            <w:hyperlink r:id="rId22" w:history="1">
+              <w:r>
+                <w:rPr>
+                  <w:rStyle w:val="Hyperlink"/>
+                </w:rPr>
+                <w:t>SSR_</w:t>
+              </w:r>
+              <w:r>
+                <w:rPr>
+                  <w:rStyle w:val="Hyperlink"/>
+                  <w:kern w:val="0"/>
+                  <w14:ligatures w14:val="none"/>
+                </w:rPr>
+                <w:t xml:space="preserve"> </w:t>
+              </w:r>
+              <w:r>
+                <w:rPr>
+                  <w:rStyle w:val="Hyperlink"/>
+                </w:rPr>
+                <w:t>Browser</w:t>
+              </w:r>
+              <w:r>
+                <w:rPr>
+                  <w:rStyle w:val="Hyperlink"/>
+                </w:rPr>
+                <w:t>R</w:t>
+              </w:r>
+              <w:r>
+                <w:rPr>
+                  <w:rStyle w:val="Hyperlink"/>
+                </w:rPr>
+                <w:t>efresh</w:t>
+              </w:r>
+              <w:r>
+                <w:rPr>
+                  <w:rStyle w:val="Hyperlink"/>
+                </w:rPr>
+                <w:t>W</w:t>
+              </w:r>
+              <w:r>
+                <w:rPr>
+                  <w:rStyle w:val="Hyperlink"/>
+                </w:rPr>
+                <w:t>ith</w:t>
+              </w:r>
+              <w:r>
+                <w:rPr>
+                  <w:rStyle w:val="Hyperlink"/>
+                </w:rPr>
+                <w:t>C</w:t>
+              </w:r>
+              <w:r>
+                <w:rPr>
+                  <w:rStyle w:val="Hyperlink"/>
+                </w:rPr>
+                <w:t>ustom</w:t>
+              </w:r>
+              <w:r>
+                <w:rPr>
+                  <w:rStyle w:val="Hyperlink"/>
+                </w:rPr>
+                <w:t>P</w:t>
+              </w:r>
+              <w:r>
+                <w:rPr>
+                  <w:rStyle w:val="Hyperlink"/>
+                </w:rPr>
+                <w:t>arameter</w:t>
+              </w:r>
+              <w:r>
+                <w:rPr>
+                  <w:rStyle w:val="Hyperlink"/>
+                </w:rPr>
+                <w:t>N</w:t>
+              </w:r>
+              <w:r>
+                <w:rPr>
+                  <w:rStyle w:val="Hyperlink"/>
+                </w:rPr>
+                <w:t>ames</w:t>
+              </w:r>
+              <w:r>
+                <w:rPr>
+                  <w:rStyle w:val="Hyperlink"/>
+                </w:rPr>
+                <w:t>.mp4</w:t>
+              </w:r>
+            </w:hyperlink>
+          </w:p>
+        </w:tc>
+        <w:tc>
+          <w:tcPr>
+            <w:tcW w:w="3344" w:type="dxa"/>
+          </w:tcPr>
+          <w:p>
+            <w:hyperlink r:id="rId23" w:history="1">
+              <w:r>
+                <w:rPr>
+                  <w:rStyle w:val="Hyperlink"/>
+                </w:rPr>
+                <w:t>S</w:t>
+              </w:r>
+              <w:r>
+                <w:rPr>
+                  <w:rStyle w:val="Hyperlink"/>
+                </w:rPr>
+                <w:t>erver</w:t>
+              </w:r>
+              <w:r>
+                <w:rPr>
+                  <w:rStyle w:val="Hyperlink"/>
+                </w:rPr>
+                <w:t>_</w:t>
+              </w:r>
+              <w:r>
+                <w:rPr>
+                  <w:rStyle w:val="Hyperlink"/>
+                  <w:kern w:val="0"/>
+                  <w14:ligatures w14:val="none"/>
+                </w:rPr>
+                <w:t xml:space="preserve"> </w:t>
+              </w:r>
+              <w:r>
+                <w:rPr>
+                  <w:rStyle w:val="Hyperlink"/>
+                </w:rPr>
+                <w:t>BrowserRefreshWithCustomParameterNames.mp4</w:t>
+              </w:r>
+            </w:hyperlink>
+          </w:p>
+        </w:tc>
+      </w:tr>
     </w:tbl>
-    <w:p>
-      <w:pPr>
-        <w:rPr>
-          <w:b/>
-          <w:bCs/>
-        </w:rPr>
-      </w:pPr>
-    </w:p>
     <w:p>
       <w:pPr>
         <w:rPr>
@@ -2134,24 +2237,13 @@
           <w:szCs w:val="32"/>
         </w:rPr>
       </w:pPr>
-    </w:p>
-    <w:p>
-      <w:pPr>
+      <w:r>
         <w:rPr>
           <w:b/>
           <w:bCs/>
           <w:sz w:val="32"/>
           <w:szCs w:val="32"/>
         </w:rPr>
-      </w:pPr>
-      <w:r>
-        <w:rPr>
-          <w:b/>
-          <w:bCs/>
-          <w:sz w:val="32"/>
-          <w:szCs w:val="32"/>
-        </w:rPr>
-        <w:lastRenderedPageBreak/>
         <w:t xml:space="preserve">URL </w:t>
       </w:r>
     </w:p>
@@ -2356,6 +2448,268 @@
       </w:tr>
     </w:tbl>
     <w:p/>
+    <w:p>
+      <w:pPr>
+        <w:rPr>
+          <w:b/>
+          <w:bCs/>
+          <w:sz w:val="36"/>
+          <w:szCs w:val="36"/>
+        </w:rPr>
+      </w:pPr>
+      <w:r>
+        <w:rPr>
+          <w:b/>
+          <w:bCs/>
+          <w:sz w:val="36"/>
+          <w:szCs w:val="36"/>
+        </w:rPr>
+        <w:t>Documentation Discoverability</w:t>
+      </w:r>
+    </w:p>
+    <w:p>
+      <w:pPr>
+        <w:pStyle w:val="ListParagraph"/>
+        <w:numPr>
+          <w:ilvl w:val="0"/>
+          <w:numId w:val="7"/>
+        </w:numPr>
+      </w:pPr>
+      <w:hyperlink r:id="rId24" w:history="1">
+        <w:r>
+          <w:rPr>
+            <w:rStyle w:val="Hyperlink"/>
+            <w:i/>
+            <w:iCs/>
+          </w:rPr>
+          <w:t>Documentation</w:t>
+        </w:r>
+      </w:hyperlink>
+      <w:r>
+        <w:rPr>
+          <w:i/>
+          <w:iCs/>
+        </w:rPr>
+        <w:t xml:space="preserve"> </w:t>
+      </w:r>
+      <w:r>
+        <w:t xml:space="preserve">was reviewed as part of validation. The </w:t>
+      </w:r>
+      <w:proofErr w:type="spellStart"/>
+      <w:r>
+        <w:t>QuickGrid</w:t>
+      </w:r>
+      <w:proofErr w:type="spellEnd"/>
+      <w:r>
+        <w:t xml:space="preserve"> documentation describes the query-parameter customization feature and explains how prefixes can be used to avoid conflicts when multiple </w:t>
+      </w:r>
+      <w:proofErr w:type="spellStart"/>
+      <w:r>
+        <w:t>QuickGrid</w:t>
+      </w:r>
+      <w:proofErr w:type="spellEnd"/>
+      <w:r>
+        <w:t xml:space="preserve"> instances are present on a page. This makes the overall capability discoverable for developers investigating shared paging or sorting state between grids. </w:t>
+      </w:r>
+    </w:p>
+    <w:p>
+      <w:pPr>
+        <w:pStyle w:val="ListParagraph"/>
+        <w:numPr>
+          <w:ilvl w:val="0"/>
+          <w:numId w:val="7"/>
+        </w:numPr>
+        <w:rPr>
+          <w:i/>
+          <w:iCs/>
+          <w:lang w:val="x-none"/>
+        </w:rPr>
+      </w:pPr>
+      <w:r>
+        <w:lastRenderedPageBreak/>
+        <w:t xml:space="preserve">However, the current documentation appears to reference </w:t>
+      </w:r>
+      <w:proofErr w:type="spellStart"/>
+      <w:r>
+        <w:t>QueryParameterNamePrefix</w:t>
+      </w:r>
+      <w:proofErr w:type="spellEnd"/>
+      <w:r>
+        <w:t xml:space="preserve">, while the validated .NET 11 implementation uses </w:t>
+      </w:r>
+      <w:proofErr w:type="spellStart"/>
+      <w:r>
+        <w:t>QueryParameterNameOptions</w:t>
+      </w:r>
+      <w:proofErr w:type="spellEnd"/>
+      <w:r>
+        <w:t xml:space="preserve">. As a result, the documentation may not fully reflect the current API surface introduced by the </w:t>
+      </w:r>
+      <w:proofErr w:type="spellStart"/>
+      <w:r>
+        <w:t>QuickGrid</w:t>
+      </w:r>
+      <w:proofErr w:type="spellEnd"/>
+      <w:r>
+        <w:t xml:space="preserve"> query parameter naming changes. </w:t>
+      </w:r>
+      <w:r>
+        <w:rPr>
+          <w:i/>
+          <w:iCs/>
+        </w:rPr>
+        <w:t xml:space="preserve">[PR reference: </w:t>
+      </w:r>
+      <w:hyperlink r:id="rId25" w:history="1">
+        <w:r>
+          <w:rPr>
+            <w:rStyle w:val="Hyperlink"/>
+            <w:i/>
+            <w:iCs/>
+            <w:lang w:val="x-none"/>
+          </w:rPr>
+          <w:t xml:space="preserve">Fix API for </w:t>
+        </w:r>
+        <w:proofErr w:type="spellStart"/>
+        <w:r>
+          <w:rPr>
+            <w:rStyle w:val="Hyperlink"/>
+            <w:i/>
+            <w:iCs/>
+            <w:lang w:val="x-none"/>
+          </w:rPr>
+          <w:t>QuickGrid</w:t>
+        </w:r>
+        <w:proofErr w:type="spellEnd"/>
+        <w:r>
+          <w:rPr>
+            <w:rStyle w:val="Hyperlink"/>
+            <w:i/>
+            <w:iCs/>
+            <w:lang w:val="x-none"/>
+          </w:rPr>
+          <w:t xml:space="preserve"> by </w:t>
+        </w:r>
+        <w:proofErr w:type="spellStart"/>
+        <w:r>
+          <w:rPr>
+            <w:rStyle w:val="Hyperlink"/>
+            <w:i/>
+            <w:iCs/>
+            <w:lang w:val="x-none"/>
+          </w:rPr>
+          <w:t>dariatiurina</w:t>
+        </w:r>
+        <w:proofErr w:type="spellEnd"/>
+        <w:r>
+          <w:rPr>
+            <w:rStyle w:val="Hyperlink"/>
+            <w:i/>
+            <w:iCs/>
+            <w:lang w:val="x-none"/>
+          </w:rPr>
+          <w:t xml:space="preserve"> · Pull Request #67733 · dotnet/</w:t>
+        </w:r>
+        <w:proofErr w:type="spellStart"/>
+        <w:r>
+          <w:rPr>
+            <w:rStyle w:val="Hyperlink"/>
+            <w:i/>
+            <w:iCs/>
+            <w:lang w:val="x-none"/>
+          </w:rPr>
+          <w:t>aspnetcore</w:t>
+        </w:r>
+        <w:proofErr w:type="spellEnd"/>
+      </w:hyperlink>
+      <w:r>
+        <w:rPr>
+          <w:i/>
+          <w:iCs/>
+        </w:rPr>
+        <w:t>]</w:t>
+      </w:r>
+    </w:p>
+    <w:p>
+      <w:pPr>
+        <w:pStyle w:val="ListParagraph"/>
+        <w:numPr>
+          <w:ilvl w:val="0"/>
+          <w:numId w:val="7"/>
+        </w:numPr>
+        <w:rPr>
+          <w:lang w:val="x-none"/>
+        </w:rPr>
+      </w:pPr>
+      <w:r>
+        <w:t xml:space="preserve">The </w:t>
+      </w:r>
+      <w:r>
+        <w:t>feature is discoverable, but the documentation could be updated to align with the current API and provide more scenario-based guidance.</w:t>
+      </w:r>
+    </w:p>
+    <w:p>
+      <w:pPr>
+        <w:pStyle w:val="ListParagraph"/>
+        <w:rPr>
+          <w:lang w:val="x-none"/>
+        </w:rPr>
+      </w:pPr>
+    </w:p>
+    <w:p>
+      <w:pPr>
+        <w:rPr>
+          <w:lang w:val="x-none"/>
+        </w:rPr>
+      </w:pPr>
+      <w:r>
+        <w:rPr>
+          <w:lang w:val="x-none"/>
+        </w:rPr>
+        <w:drawing>
+          <wp:inline distT="0" distB="0" distL="0" distR="0" wp14:anchorId="7AAF2A76" wp14:editId="702C10CD">
+            <wp:extent cx="5943600" cy="2235200"/>
+            <wp:effectExtent l="0" t="0" r="0" b="0"/>
+            <wp:docPr id="648346390" name="Picture 1"/>
+            <wp:cNvGraphicFramePr>
+              <a:graphicFrameLocks xmlns:a="http://schemas.openxmlformats.org/drawingml/2006/main" noChangeAspect="1"/>
+            </wp:cNvGraphicFramePr>
+            <a:graphic xmlns:a="http://schemas.openxmlformats.org/drawingml/2006/main">
+              <a:graphicData uri="http://schemas.openxmlformats.org/drawingml/2006/picture">
+                <pic:pic xmlns:pic="http://schemas.openxmlformats.org/drawingml/2006/picture">
+                  <pic:nvPicPr>
+                    <pic:cNvPr id="648346390" name=""/>
+                    <pic:cNvPicPr/>
+                  </pic:nvPicPr>
+                  <pic:blipFill>
+                    <a:blip r:embed="rId26"/>
+                    <a:stretch>
+                      <a:fillRect/>
+                    </a:stretch>
+                  </pic:blipFill>
+                  <pic:spPr>
+                    <a:xfrm>
+                      <a:off x="0" y="0"/>
+                      <a:ext cx="5943600" cy="2235200"/>
+                    </a:xfrm>
+                    <a:prstGeom prst="rect">
+                      <a:avLst/>
+                    </a:prstGeom>
+                  </pic:spPr>
+                </pic:pic>
+              </a:graphicData>
+            </a:graphic>
+          </wp:inline>
+        </w:drawing>
+      </w:r>
+    </w:p>
+    <w:p>
+      <w:pPr>
+        <w:rPr>
+          <w:lang w:val="x-none"/>
+        </w:rPr>
+      </w:pPr>
+    </w:p>
     <w:p>
       <w:pPr>
         <w:rPr>
@@ -2444,6 +2798,155 @@
 <file path=word/numbering.xml><?xml version="1.0" encoding="utf-8"?>
 <w:numbering xmlns:wpc="http://schemas.microsoft.com/office/word/2010/wordprocessingCanvas" xmlns:cx="http://schemas.microsoft.com/office/drawing/2014/chartex" xmlns:cx1="http://schemas.microsoft.com/office/drawing/2015/9/8/chartex" xmlns:cx2="http://schemas.microsoft.com/office/drawing/2015/10/21/chartex" xmlns:cx3="http://schemas.microsoft.com/office/drawing/2016/5/9/chartex" xmlns:cx4="http://schemas.microsoft.com/office/drawing/2016/5/10/chartex" xmlns:cx5="http://schemas.microsoft.com/office/drawing/2016/5/11/chartex" xmlns:cx6="http://schemas.microsoft.com/office/drawing/2016/5/12/chartex" xmlns:cx7="http://schemas.microsoft.com/office/drawing/2016/5/13/chartex" xmlns:cx8="http://schemas.microsoft.com/office/drawing/2016/5/14/chartex" xmlns:mc="http://schemas.openxmlformats.org/markup-compatibility/2006" xmlns:aink="http://schemas.microsoft.com/office/drawing/2016/ink" xmlns:am3d="http://schemas.microsoft.com/office/drawing/2017/model3d" xmlns:o="urn:schemas-microsoft-com:office:office" xmlns:oel="http://schemas.microsoft.com/office/2019/extlst" xmlns:r="http://schemas.openxmlformats.org/officeDocument/2006/relationships" xmlns:m="http://schemas.openxmlformats.org/officeDocument/2006/math" xmlns:v="urn:schemas-microsoft-com:vml" xmlns:wp14="http://schemas.microsoft.com/office/word/2010/wordprocessingDrawing" xmlns:wp="http://schemas.openxmlformats.org/drawingml/2006/wordprocessingDrawing" xmlns:w10="urn:schemas-microsoft-com:office:word" xmlns:w="http://schemas.openxmlformats.org/wordprocessingml/2006/main" xmlns:w14="http://schemas.microsoft.com/office/word/2010/wordml" xmlns:w15="http://schemas.microsoft.com/office/word/2012/wordml" xmlns:w16cei="http://schemas.microsoft.com/office/word/2026/wordml/cei" xmlns:w16cex="http://schemas.microsoft.com/office/word/2018/wordml/cex" xmlns:w16cid="http://schemas.microsoft.com/office/word/2016/wordml/cid" xmlns:w16="http://schemas.microsoft.com/office/word/2018/wordml" xmlns:w16du="http://schemas.microsoft.com/office/word/2023/wordml/word16du" xmlns:w16sdtdh="http://schemas.microsoft.com/office/word/2020/wordml/sdtdatahash" xmlns:w16sdtfl="http://schemas.microsoft.com/office/word/2024/wordml/sdtformatlock" xmlns:w16se="http://schemas.microsoft.com/office/word/2015/wordml/symex" xmlns:wpg="http://schemas.microsoft.com/office/word/2010/wordprocessingGroup" xmlns:wpi="http://schemas.microsoft.com/office/word/2010/wordprocessingInk" xmlns:wne="http://schemas.microsoft.com/office/word/2006/wordml" xmlns:wps="http://schemas.microsoft.com/office/word/2010/wordprocessingShape" mc:Ignorable="w14 w15 w16se w16cid w16 w16cex w16sdtdh w16sdtfl w16du wp14">
   <w:abstractNum w:abstractNumId="0" w15:restartNumberingAfterBreak="0">
+    <w:nsid w:val="00660467"/>
+    <w:multiLevelType w:val="multilevel"/>
+    <w:tmpl w:val="182CBD62"/>
+    <w:lvl w:ilvl="0">
+      <w:start w:val="1"/>
+      <w:numFmt w:val="bullet"/>
+      <w:lvlText w:val=""/>
+      <w:lvlJc w:val="left"/>
+      <w:pPr>
+        <w:tabs>
+          <w:tab w:val="num" w:pos="720"/>
+        </w:tabs>
+        <w:ind w:left="720" w:hanging="360"/>
+      </w:pPr>
+      <w:rPr>
+        <w:rFonts w:ascii="Symbol" w:hAnsi="Symbol" w:hint="default"/>
+        <w:sz w:val="20"/>
+      </w:rPr>
+    </w:lvl>
+    <w:lvl w:ilvl="1" w:tentative="1">
+      <w:start w:val="1"/>
+      <w:numFmt w:val="bullet"/>
+      <w:lvlText w:val="o"/>
+      <w:lvlJc w:val="left"/>
+      <w:pPr>
+        <w:tabs>
+          <w:tab w:val="num" w:pos="1440"/>
+        </w:tabs>
+        <w:ind w:left="1440" w:hanging="360"/>
+      </w:pPr>
+      <w:rPr>
+        <w:rFonts w:ascii="Courier New" w:hAnsi="Courier New" w:hint="default"/>
+        <w:sz w:val="20"/>
+      </w:rPr>
+    </w:lvl>
+    <w:lvl w:ilvl="2" w:tentative="1">
+      <w:start w:val="1"/>
+      <w:numFmt w:val="bullet"/>
+      <w:lvlText w:val=""/>
+      <w:lvlJc w:val="left"/>
+      <w:pPr>
+        <w:tabs>
+          <w:tab w:val="num" w:pos="2160"/>
+        </w:tabs>
+        <w:ind w:left="2160" w:hanging="360"/>
+      </w:pPr>
+      <w:rPr>
+        <w:rFonts w:ascii="Wingdings" w:hAnsi="Wingdings" w:hint="default"/>
+        <w:sz w:val="20"/>
+      </w:rPr>
+    </w:lvl>
+    <w:lvl w:ilvl="3" w:tentative="1">
+      <w:start w:val="1"/>
+      <w:numFmt w:val="bullet"/>
+      <w:lvlText w:val=""/>
+      <w:lvlJc w:val="left"/>
+      <w:pPr>
+        <w:tabs>
+          <w:tab w:val="num" w:pos="2880"/>
+        </w:tabs>
+        <w:ind w:left="2880" w:hanging="360"/>
+      </w:pPr>
+      <w:rPr>
+        <w:rFonts w:ascii="Wingdings" w:hAnsi="Wingdings" w:hint="default"/>
+        <w:sz w:val="20"/>
+      </w:rPr>
+    </w:lvl>
+    <w:lvl w:ilvl="4" w:tentative="1">
+      <w:start w:val="1"/>
+      <w:numFmt w:val="bullet"/>
+      <w:lvlText w:val=""/>
+      <w:lvlJc w:val="left"/>
+      <w:pPr>
+        <w:tabs>
+          <w:tab w:val="num" w:pos="3600"/>
+        </w:tabs>
+        <w:ind w:left="3600" w:hanging="360"/>
+      </w:pPr>
+      <w:rPr>
+        <w:rFonts w:ascii="Wingdings" w:hAnsi="Wingdings" w:hint="default"/>
+        <w:sz w:val="20"/>
+      </w:rPr>
+    </w:lvl>
+    <w:lvl w:ilvl="5" w:tentative="1">
+      <w:start w:val="1"/>
+      <w:numFmt w:val="bullet"/>
+      <w:lvlText w:val=""/>
+      <w:lvlJc w:val="left"/>
+      <w:pPr>
+        <w:tabs>
+          <w:tab w:val="num" w:pos="4320"/>
+        </w:tabs>
+        <w:ind w:left="4320" w:hanging="360"/>
+      </w:pPr>
+      <w:rPr>
+        <w:rFonts w:ascii="Wingdings" w:hAnsi="Wingdings" w:hint="default"/>
+        <w:sz w:val="20"/>
+      </w:rPr>
+    </w:lvl>
+    <w:lvl w:ilvl="6" w:tentative="1">
+      <w:start w:val="1"/>
+      <w:numFmt w:val="bullet"/>
+      <w:lvlText w:val=""/>
+      <w:lvlJc w:val="left"/>
+      <w:pPr>
+        <w:tabs>
+          <w:tab w:val="num" w:pos="5040"/>
+        </w:tabs>
+        <w:ind w:left="5040" w:hanging="360"/>
+      </w:pPr>
+      <w:rPr>
+        <w:rFonts w:ascii="Wingdings" w:hAnsi="Wingdings" w:hint="default"/>
+        <w:sz w:val="20"/>
+      </w:rPr>
+    </w:lvl>
+    <w:lvl w:ilvl="7" w:tentative="1">
+      <w:start w:val="1"/>
+      <w:numFmt w:val="bullet"/>
+      <w:lvlText w:val=""/>
+      <w:lvlJc w:val="left"/>
+      <w:pPr>
+        <w:tabs>
+          <w:tab w:val="num" w:pos="5760"/>
+        </w:tabs>
+        <w:ind w:left="5760" w:hanging="360"/>
+      </w:pPr>
+      <w:rPr>
+        <w:rFonts w:ascii="Wingdings" w:hAnsi="Wingdings" w:hint="default"/>
+        <w:sz w:val="20"/>
+      </w:rPr>
+    </w:lvl>
+    <w:lvl w:ilvl="8" w:tentative="1">
+      <w:start w:val="1"/>
+      <w:numFmt w:val="bullet"/>
+      <w:lvlText w:val=""/>
+      <w:lvlJc w:val="left"/>
+      <w:pPr>
+        <w:tabs>
+          <w:tab w:val="num" w:pos="6480"/>
+        </w:tabs>
+        <w:ind w:left="6480" w:hanging="360"/>
+      </w:pPr>
+      <w:rPr>
+        <w:rFonts w:ascii="Wingdings" w:hAnsi="Wingdings" w:hint="default"/>
+        <w:sz w:val="20"/>
+      </w:rPr>
+    </w:lvl>
+  </w:abstractNum>
+  <w:abstractNum w:abstractNumId="1" w15:restartNumberingAfterBreak="0">
     <w:nsid w:val="0A185C58"/>
     <w:multiLevelType w:val="multilevel"/>
     <w:tmpl w:val="AB3C8D48"/>
@@ -2592,7 +3095,7 @@
       </w:rPr>
     </w:lvl>
   </w:abstractNum>
-  <w:abstractNum w:abstractNumId="1" w15:restartNumberingAfterBreak="0">
+  <w:abstractNum w:abstractNumId="2" w15:restartNumberingAfterBreak="0">
     <w:nsid w:val="1CF21C26"/>
     <w:multiLevelType w:val="multilevel"/>
     <w:tmpl w:val="40AECE30"/>
@@ -2741,7 +3244,120 @@
       </w:rPr>
     </w:lvl>
   </w:abstractNum>
-  <w:abstractNum w:abstractNumId="2" w15:restartNumberingAfterBreak="0">
+  <w:abstractNum w:abstractNumId="3" w15:restartNumberingAfterBreak="0">
+    <w:nsid w:val="2A4A1996"/>
+    <w:multiLevelType w:val="hybridMultilevel"/>
+    <w:tmpl w:val="81E6E976"/>
+    <w:lvl w:ilvl="0" w:tplc="04090001">
+      <w:start w:val="1"/>
+      <w:numFmt w:val="bullet"/>
+      <w:lvlText w:val=""/>
+      <w:lvlJc w:val="left"/>
+      <w:pPr>
+        <w:ind w:left="720" w:hanging="360"/>
+      </w:pPr>
+      <w:rPr>
+        <w:rFonts w:ascii="Symbol" w:hAnsi="Symbol" w:hint="default"/>
+      </w:rPr>
+    </w:lvl>
+    <w:lvl w:ilvl="1" w:tplc="04090003" w:tentative="1">
+      <w:start w:val="1"/>
+      <w:numFmt w:val="bullet"/>
+      <w:lvlText w:val="o"/>
+      <w:lvlJc w:val="left"/>
+      <w:pPr>
+        <w:ind w:left="1440" w:hanging="360"/>
+      </w:pPr>
+      <w:rPr>
+        <w:rFonts w:ascii="Courier New" w:hAnsi="Courier New" w:cs="Courier New" w:hint="default"/>
+      </w:rPr>
+    </w:lvl>
+    <w:lvl w:ilvl="2" w:tplc="04090005" w:tentative="1">
+      <w:start w:val="1"/>
+      <w:numFmt w:val="bullet"/>
+      <w:lvlText w:val=""/>
+      <w:lvlJc w:val="left"/>
+      <w:pPr>
+        <w:ind w:left="2160" w:hanging="360"/>
+      </w:pPr>
+      <w:rPr>
+        <w:rFonts w:ascii="Wingdings" w:hAnsi="Wingdings" w:hint="default"/>
+      </w:rPr>
+    </w:lvl>
+    <w:lvl w:ilvl="3" w:tplc="04090001" w:tentative="1">
+      <w:start w:val="1"/>
+      <w:numFmt w:val="bullet"/>
+      <w:lvlText w:val=""/>
+      <w:lvlJc w:val="left"/>
+      <w:pPr>
+        <w:ind w:left="2880" w:hanging="360"/>
+      </w:pPr>
+      <w:rPr>
+        <w:rFonts w:ascii="Symbol" w:hAnsi="Symbol" w:hint="default"/>
+      </w:rPr>
+    </w:lvl>
+    <w:lvl w:ilvl="4" w:tplc="04090003" w:tentative="1">
+      <w:start w:val="1"/>
+      <w:numFmt w:val="bullet"/>
+      <w:lvlText w:val="o"/>
+      <w:lvlJc w:val="left"/>
+      <w:pPr>
+        <w:ind w:left="3600" w:hanging="360"/>
+      </w:pPr>
+      <w:rPr>
+        <w:rFonts w:ascii="Courier New" w:hAnsi="Courier New" w:cs="Courier New" w:hint="default"/>
+      </w:rPr>
+    </w:lvl>
+    <w:lvl w:ilvl="5" w:tplc="04090005" w:tentative="1">
+      <w:start w:val="1"/>
+      <w:numFmt w:val="bullet"/>
+      <w:lvlText w:val=""/>
+      <w:lvlJc w:val="left"/>
+      <w:pPr>
+        <w:ind w:left="4320" w:hanging="360"/>
+      </w:pPr>
+      <w:rPr>
+        <w:rFonts w:ascii="Wingdings" w:hAnsi="Wingdings" w:hint="default"/>
+      </w:rPr>
+    </w:lvl>
+    <w:lvl w:ilvl="6" w:tplc="04090001" w:tentative="1">
+      <w:start w:val="1"/>
+      <w:numFmt w:val="bullet"/>
+      <w:lvlText w:val=""/>
+      <w:lvlJc w:val="left"/>
+      <w:pPr>
+        <w:ind w:left="5040" w:hanging="360"/>
+      </w:pPr>
+      <w:rPr>
+        <w:rFonts w:ascii="Symbol" w:hAnsi="Symbol" w:hint="default"/>
+      </w:rPr>
+    </w:lvl>
+    <w:lvl w:ilvl="7" w:tplc="04090003" w:tentative="1">
+      <w:start w:val="1"/>
+      <w:numFmt w:val="bullet"/>
+      <w:lvlText w:val="o"/>
+      <w:lvlJc w:val="left"/>
+      <w:pPr>
+        <w:ind w:left="5760" w:hanging="360"/>
+      </w:pPr>
+      <w:rPr>
+        <w:rFonts w:ascii="Courier New" w:hAnsi="Courier New" w:cs="Courier New" w:hint="default"/>
+      </w:rPr>
+    </w:lvl>
+    <w:lvl w:ilvl="8" w:tplc="04090005" w:tentative="1">
+      <w:start w:val="1"/>
+      <w:numFmt w:val="bullet"/>
+      <w:lvlText w:val=""/>
+      <w:lvlJc w:val="left"/>
+      <w:pPr>
+        <w:ind w:left="6480" w:hanging="360"/>
+      </w:pPr>
+      <w:rPr>
+        <w:rFonts w:ascii="Wingdings" w:hAnsi="Wingdings" w:hint="default"/>
+      </w:rPr>
+    </w:lvl>
+  </w:abstractNum>
+  <w:abstractNum w:abstractNumId="4" w15:restartNumberingAfterBreak="0">
     <w:nsid w:val="3EDD5813"/>
     <w:multiLevelType w:val="hybridMultilevel"/>
     <w:tmpl w:val="5254D092"/>
@@ -2827,7 +3443,7 @@
       </w:pPr>
     </w:lvl>
   </w:abstractNum>
-  <w:abstractNum w:abstractNumId="3" w15:restartNumberingAfterBreak="0">
+  <w:abstractNum w:abstractNumId="5" w15:restartNumberingAfterBreak="0">
     <w:nsid w:val="752D2234"/>
     <w:multiLevelType w:val="multilevel"/>
     <w:tmpl w:val="DC4E5200"/>
@@ -2976,7 +3592,7 @@
       </w:rPr>
     </w:lvl>
   </w:abstractNum>
-  <w:abstractNum w:abstractNumId="4" w15:restartNumberingAfterBreak="0">
+  <w:abstractNum w:abstractNumId="6" w15:restartNumberingAfterBreak="0">
     <w:nsid w:val="7F583735"/>
     <w:multiLevelType w:val="multilevel"/>
     <w:tmpl w:val="58345F60"/>
@@ -3126,19 +3742,25 @@
     </w:lvl>
   </w:abstractNum>
   <w:num w:numId="1" w16cid:durableId="835611551">
+    <w:abstractNumId w:val="6"/>
+  </w:num>
+  <w:num w:numId="2" w16cid:durableId="463349909">
+    <w:abstractNumId w:val="5"/>
+  </w:num>
+  <w:num w:numId="3" w16cid:durableId="1174078290">
+    <w:abstractNumId w:val="1"/>
+  </w:num>
+  <w:num w:numId="4" w16cid:durableId="1209800424">
+    <w:abstractNumId w:val="2"/>
+  </w:num>
+  <w:num w:numId="5" w16cid:durableId="1908607681">
     <w:abstractNumId w:val="4"/>
   </w:num>
-  <w:num w:numId="2" w16cid:durableId="463349909">
-    <w:abstractNumId w:val="3"/>
-  </w:num>
-  <w:num w:numId="3" w16cid:durableId="1174078290">
+  <w:num w:numId="6" w16cid:durableId="2250458">
     <w:abstractNumId w:val="0"/>
   </w:num>
-  <w:num w:numId="4" w16cid:durableId="1209800424">
-    <w:abstractNumId w:val="1"/>
-  </w:num>
-  <w:num w:numId="5" w16cid:durableId="1908607681">
-    <w:abstractNumId w:val="2"/>
+  <w:num w:numId="7" w16cid:durableId="1862235134">
+    <w:abstractNumId w:val="3"/>
   </w:num>
 </w:numbering>
 </file>
@@ -4101,6 +4723,17 @@
       </w:tblBorders>
     </w:tblPr>
   </w:style>
+  <w:style w:type="paragraph" w:styleId="NormalWeb">
+    <w:name w:val="Normal (Web)"/>
+    <w:basedOn w:val="Normal"/>
+    <w:uiPriority w:val="99"/>
+    <w:semiHidden/>
+    <w:unhideWhenUsed/>
+    <w:rsid w:val="00E941A5"/>
+    <w:rPr>
+      <w:rFonts w:ascii="Times New Roman" w:hAnsi="Times New Roman" w:cs="Times New Roman"/>
+    </w:rPr>
+  </w:style>
 </w:styles>
 </file>
 

</xml_diff>